<commit_message>
VU March drafts + script updates
</commit_message>
<xml_diff>
--- a/docx_resources/Вечірня-Утреня/13-ТРОЇЧНІ ТРОПАРІ - СВІТИЛЬНІ.docx
+++ b/docx_resources/Вечірня-Утреня/13-ТРОЇЧНІ ТРОПАРІ - СВІТИЛЬНІ.docx
@@ -278,15 +278,23 @@
           <w:sz w:val="24"/>
           <w:szCs w:val="24"/>
         </w:rPr>
-        <w:t xml:space="preserve"> З</w:t>
-      </w:r>
-      <w:r>
-        <w:rPr>
-          <w:rFonts w:ascii="Times New Roman" w:hAnsi="Times New Roman"/>
-          <w:sz w:val="24"/>
-          <w:szCs w:val="24"/>
-        </w:rPr>
-        <w:t xml:space="preserve"> усіма небесними силами по-херувимському заспіваймо тому*, хто на висотах, засилаючи трисвяту хвалу:* Свят, свят, свят єси, Боже наш!* Задля молитов усіх святих твоїх, помилуй нас.</w:t>
+        <w:t xml:space="preserve"> З усіма небесними силами по-херувимському заспіваймо тому*, хто на висотах, засилаючи трисвяту хвалу:* Свят, свят, свят єси, Боже наш!* Задля молитов усіх святих </w:t>
+      </w:r>
+      <w:r>
+        <w:rPr>
+          <w:rFonts w:ascii="Times New Roman" w:hAnsi="Times New Roman"/>
+          <w:sz w:val="24"/>
+          <w:szCs w:val="24"/>
+        </w:rPr>
+        <w:t>Тво</w:t>
+      </w:r>
+      <w:r>
+        <w:rPr>
+          <w:rFonts w:ascii="Times New Roman" w:hAnsi="Times New Roman"/>
+          <w:sz w:val="24"/>
+          <w:szCs w:val="24"/>
+        </w:rPr>
+        <w:t>їх, помилуй нас.</w:t>
       </w:r>
     </w:p>
     <w:p>
@@ -314,15 +322,7 @@
           <w:sz w:val="24"/>
           <w:szCs w:val="24"/>
         </w:rPr>
-        <w:t xml:space="preserve"> Уставши від сну, припадаємо до тебе, Добрий,* і ангельську пісню сп</w:t>
-      </w:r>
-      <w:r>
-        <w:rPr>
-          <w:rFonts w:ascii="Times New Roman" w:hAnsi="Times New Roman"/>
-          <w:sz w:val="24"/>
-          <w:szCs w:val="24"/>
-        </w:rPr>
-        <w:t>іваємо тобі, Всесильний:* Свят, свят, свят єси, Боже наш!* Богородиці ради, помилуй нас.</w:t>
+        <w:t xml:space="preserve"> Уставши від сну, припадаємо до тебе, Добрий,* і ангельську пісню співаємо тобі, Всесильний:* Свят, свят, свят єси, Боже наш!* Богородиці ради, помилуй нас.</w:t>
       </w:r>
     </w:p>
     <w:p>
@@ -375,7 +375,23 @@
           <w:sz w:val="24"/>
           <w:szCs w:val="24"/>
         </w:rPr>
-        <w:t xml:space="preserve"> Нестворене єство, Творче всього,* відкрий уста наші, щоб ми звіщали хвалу твою, виголошуючи:* Свят, свят, свят єси, Боже наш,*</w:t>
+        <w:t xml:space="preserve"> Нестворене єство, Творче всього,* відкрий уста наші, щоб ми звіщали хвалу</w:t>
+      </w:r>
+      <w:r>
+        <w:rPr>
+          <w:rFonts w:ascii="Times New Roman" w:hAnsi="Times New Roman"/>
+          <w:sz w:val="24"/>
+          <w:szCs w:val="24"/>
+        </w:rPr>
+        <w:t xml:space="preserve"> Тво</w:t>
+      </w:r>
+      <w:r>
+        <w:rPr>
+          <w:rFonts w:ascii="Times New Roman" w:hAnsi="Times New Roman"/>
+          <w:sz w:val="24"/>
+          <w:szCs w:val="24"/>
+        </w:rPr>
+        <w:t>ю, виголошуючи:* Свят, свят, свят єси, Боже наш,*</w:t>
       </w:r>
     </w:p>
     <w:p>
@@ -583,15 +599,23 @@
           <w:sz w:val="24"/>
           <w:szCs w:val="24"/>
         </w:rPr>
-        <w:t xml:space="preserve"> Наслі</w:t>
-      </w:r>
-      <w:r>
-        <w:rPr>
-          <w:rFonts w:ascii="Times New Roman" w:hAnsi="Times New Roman"/>
-          <w:sz w:val="24"/>
-          <w:szCs w:val="24"/>
-        </w:rPr>
-        <w:t>дуючи небесні сили,* ми на землі пісню перемоги співаємо тобі, Добрий:* Свят, свят, свят єси, Боже наш!* Задля молитов усіх святих твоїх, помилуй нас.</w:t>
+        <w:t xml:space="preserve"> Наслідуючи небесні сили,* ми на землі пісню перемоги співаємо тобі, Добрий:* Свят, свят, свят єси, Боже наш!* Задля молитов усіх святих</w:t>
+      </w:r>
+      <w:r>
+        <w:rPr>
+          <w:rFonts w:ascii="Times New Roman" w:hAnsi="Times New Roman"/>
+          <w:sz w:val="24"/>
+          <w:szCs w:val="24"/>
+        </w:rPr>
+        <w:t xml:space="preserve"> Тво</w:t>
+      </w:r>
+      <w:r>
+        <w:rPr>
+          <w:rFonts w:ascii="Times New Roman" w:hAnsi="Times New Roman"/>
+          <w:sz w:val="24"/>
+          <w:szCs w:val="24"/>
+        </w:rPr>
+        <w:t>їх, помилуй нас.</w:t>
       </w:r>
     </w:p>
     <w:p>
@@ -619,15 +643,7 @@
           <w:sz w:val="24"/>
           <w:szCs w:val="24"/>
         </w:rPr>
-        <w:t xml:space="preserve"> З постелі й від сну підвів ти мене, Господи,* тож мій розум і серце просвіти,* і відкрий мої уста</w:t>
-      </w:r>
-      <w:r>
-        <w:rPr>
-          <w:rFonts w:ascii="Times New Roman" w:hAnsi="Times New Roman"/>
-          <w:sz w:val="24"/>
-          <w:szCs w:val="24"/>
-        </w:rPr>
-        <w:t>, щоб прославляти тебе, свята Тройце:* Свят, свят, свят єси, Боже наш!* Богородиці ради, помилуй нас.</w:t>
+        <w:t xml:space="preserve"> З постелі й від сну підвів ти мене, Господи,* тож мій розум і серце просвіти,* і відкрий мої уста, щоб прославляти тебе, свята Тройце:* Свят, свят, свят єси, Боже наш!* Богородиці ради, помилуй нас.</w:t>
       </w:r>
     </w:p>
     <w:p>
@@ -889,15 +905,7 @@
           <w:sz w:val="24"/>
           <w:szCs w:val="24"/>
         </w:rPr>
-        <w:t xml:space="preserve"> Отця безпочаткового, Сина рівнобезпочаткового,* Духа рівносущного – Божество єдине, по-хе</w:t>
-      </w:r>
-      <w:r>
-        <w:rPr>
-          <w:rFonts w:ascii="Times New Roman" w:hAnsi="Times New Roman"/>
-          <w:sz w:val="24"/>
-          <w:szCs w:val="24"/>
-        </w:rPr>
-        <w:t>рувимському славословити осмілившись, кажемо:* Свят, свят, свят єси, Боже наш, звеличений у Тройці, помилуй нас.</w:t>
+        <w:t xml:space="preserve"> Отця безпочаткового, Сина рівнобезпочаткового,* Духа рівносущного – Божество єдине, по-херувимському славословити осмілившись, кажемо:* Свят, свят, свят єси, Боже наш, звеличений у Тройці, помилуй нас.</w:t>
       </w:r>
     </w:p>
     <w:p>
@@ -925,15 +933,7 @@
           <w:sz w:val="24"/>
           <w:szCs w:val="24"/>
         </w:rPr>
-        <w:t xml:space="preserve"> Несподівано прийде Суддя,* і вчинки кожного стануть явні;* тому опівночі зі страхом закличмо:* Свят, свят, свят єси, Боже наш!* Богород</w:t>
-      </w:r>
-      <w:r>
-        <w:rPr>
-          <w:rFonts w:ascii="Times New Roman" w:hAnsi="Times New Roman"/>
-          <w:sz w:val="24"/>
-          <w:szCs w:val="24"/>
-        </w:rPr>
-        <w:t>иці ради, помилуй нас.</w:t>
+        <w:t xml:space="preserve"> Несподівано прийде Суддя,* і вчинки кожного стануть явні;* тому опівночі зі страхом закличмо:* Свят, свят, свят єси, Боже наш!* Богородиці ради, помилуй нас.</w:t>
       </w:r>
     </w:p>
     <w:p>
@@ -986,7 +986,55 @@
           <w:sz w:val="24"/>
           <w:szCs w:val="24"/>
         </w:rPr>
-        <w:t xml:space="preserve"> Безпочаткового твого Отця і тебе, Христе Боже, і пресвятого твого Духа,* по-херувимському славословити осмілюємося й мовимо:* Свят, свят, свят єси, Боже наш,*</w:t>
+        <w:t xml:space="preserve"> Безпочаткового</w:t>
+      </w:r>
+      <w:r>
+        <w:rPr>
+          <w:rFonts w:ascii="Times New Roman" w:hAnsi="Times New Roman"/>
+          <w:sz w:val="24"/>
+          <w:szCs w:val="24"/>
+        </w:rPr>
+        <w:t xml:space="preserve"> Тво</w:t>
+      </w:r>
+      <w:r>
+        <w:rPr>
+          <w:rFonts w:ascii="Times New Roman" w:hAnsi="Times New Roman"/>
+          <w:sz w:val="24"/>
+          <w:szCs w:val="24"/>
+        </w:rPr>
+        <w:t xml:space="preserve">го Отця і </w:t>
+      </w:r>
+      <w:r>
+        <w:rPr>
+          <w:rFonts w:ascii="Times New Roman" w:hAnsi="Times New Roman"/>
+          <w:sz w:val="24"/>
+          <w:szCs w:val="24"/>
+        </w:rPr>
+        <w:t>Т</w:t>
+      </w:r>
+      <w:r>
+        <w:rPr>
+          <w:rFonts w:ascii="Times New Roman" w:hAnsi="Times New Roman"/>
+          <w:sz w:val="24"/>
+          <w:szCs w:val="24"/>
+        </w:rPr>
+        <w:t xml:space="preserve">ебе, Христе Боже, і пресвятого </w:t>
+      </w:r>
+      <w:r>
+        <w:rPr>
+          <w:rFonts w:ascii="Times New Roman" w:hAnsi="Times New Roman"/>
+          <w:sz w:val="24"/>
+          <w:szCs w:val="24"/>
+        </w:rPr>
+        <w:t>Т</w:t>
+      </w:r>
+      <w:r>
+        <w:rPr>
+          <w:rFonts w:ascii="Times New Roman" w:hAnsi="Times New Roman"/>
+          <w:sz w:val="24"/>
+          <w:szCs w:val="24"/>
+        </w:rPr>
+        <w:t>вого Духа,* по-херувимському славословити осмілюємося й мовимо:* Свят, свят, свят єси, Боже наш,*</w:t>
       </w:r>
     </w:p>
     <w:p>
@@ -1194,15 +1242,23 @@
           <w:sz w:val="24"/>
           <w:szCs w:val="24"/>
         </w:rPr>
-        <w:t xml:space="preserve"> Як чини ангельські тепер на небі, так і ми, люди на землі,* з острахом перем</w:t>
-      </w:r>
-      <w:r>
-        <w:rPr>
-          <w:rFonts w:ascii="Times New Roman" w:hAnsi="Times New Roman"/>
-          <w:sz w:val="24"/>
-          <w:szCs w:val="24"/>
-        </w:rPr>
-        <w:t>ожну пісню приносимо тобі, Добрий:* Свят, свят, свят єси, Боже наш!* Задля молитов усіх святих твоїх, помилуй нас.</w:t>
+        <w:t xml:space="preserve"> Як чини ангельські тепер на небі, так і ми, люди на землі,* з острахом переможну пісню приносимо тобі, Добрий:* Свят, свят, свят єси, Боже наш!* Задля молитов усіх святих</w:t>
+      </w:r>
+      <w:r>
+        <w:rPr>
+          <w:rFonts w:ascii="Times New Roman" w:hAnsi="Times New Roman"/>
+          <w:sz w:val="24"/>
+          <w:szCs w:val="24"/>
+        </w:rPr>
+        <w:t xml:space="preserve"> Тво</w:t>
+      </w:r>
+      <w:r>
+        <w:rPr>
+          <w:rFonts w:ascii="Times New Roman" w:hAnsi="Times New Roman"/>
+          <w:sz w:val="24"/>
+          <w:szCs w:val="24"/>
+        </w:rPr>
+        <w:t>їх, помилуй нас.</w:t>
       </w:r>
     </w:p>
     <w:p>
@@ -1230,7 +1286,23 @@
           <w:sz w:val="24"/>
           <w:szCs w:val="24"/>
         </w:rPr>
-        <w:t xml:space="preserve"> Мудрих твоїх слуг пісню ми, смертні,* осмілюємося приносити і кажемо:* Свят, свят, свят єси, Боже наш!* Богородиці ради, помилуй нас.</w:t>
+        <w:t xml:space="preserve"> Мудрих</w:t>
+      </w:r>
+      <w:r>
+        <w:rPr>
+          <w:rFonts w:ascii="Times New Roman" w:hAnsi="Times New Roman"/>
+          <w:sz w:val="24"/>
+          <w:szCs w:val="24"/>
+        </w:rPr>
+        <w:t xml:space="preserve"> Тво</w:t>
+      </w:r>
+      <w:r>
+        <w:rPr>
+          <w:rFonts w:ascii="Times New Roman" w:hAnsi="Times New Roman"/>
+          <w:sz w:val="24"/>
+          <w:szCs w:val="24"/>
+        </w:rPr>
+        <w:t>їх слуг пісню ми, смертні,* осмілюємося приносити і кажемо:* Свят, свят, свят єси, Боже наш!* Богородиці ради, помилуй нас.</w:t>
       </w:r>
     </w:p>
     <w:p>
@@ -1491,15 +1563,39 @@
           <w:sz w:val="24"/>
           <w:szCs w:val="24"/>
         </w:rPr>
-        <w:t xml:space="preserve"> Тройце безпочаткова! За прикладом твоїх духовних воїнств,*</w:t>
-      </w:r>
-      <w:r>
-        <w:rPr>
-          <w:rFonts w:ascii="Times New Roman" w:hAnsi="Times New Roman"/>
-          <w:sz w:val="24"/>
-          <w:szCs w:val="24"/>
-        </w:rPr>
-        <w:t xml:space="preserve"> ми недостойними устами осмілюємося співати:* Свят, свят, свят єси, Боже наш!* Задля молитов усіх святих твоїх, помилуй нас.</w:t>
+        <w:t xml:space="preserve"> Тройце безпочаткова! За прикладом</w:t>
+      </w:r>
+      <w:r>
+        <w:rPr>
+          <w:rFonts w:ascii="Times New Roman" w:hAnsi="Times New Roman"/>
+          <w:sz w:val="24"/>
+          <w:szCs w:val="24"/>
+        </w:rPr>
+        <w:t xml:space="preserve"> Тво</w:t>
+      </w:r>
+      <w:r>
+        <w:rPr>
+          <w:rFonts w:ascii="Times New Roman" w:hAnsi="Times New Roman"/>
+          <w:sz w:val="24"/>
+          <w:szCs w:val="24"/>
+        </w:rPr>
+        <w:t>їх духовних воїнств,* ми недостойними устами осмілюємося співати:* Свят, свят, свят єси, Боже наш!* Задля молитов усіх святих</w:t>
+      </w:r>
+      <w:r>
+        <w:rPr>
+          <w:rFonts w:ascii="Times New Roman" w:hAnsi="Times New Roman"/>
+          <w:sz w:val="24"/>
+          <w:szCs w:val="24"/>
+        </w:rPr>
+        <w:t xml:space="preserve"> Тво</w:t>
+      </w:r>
+      <w:r>
+        <w:rPr>
+          <w:rFonts w:ascii="Times New Roman" w:hAnsi="Times New Roman"/>
+          <w:sz w:val="24"/>
+          <w:szCs w:val="24"/>
+        </w:rPr>
+        <w:t>їх, помилуй нас.</w:t>
       </w:r>
     </w:p>
     <w:p>
@@ -1527,15 +1623,7 @@
           <w:sz w:val="24"/>
           <w:szCs w:val="24"/>
         </w:rPr>
-        <w:t>Ти, що в утробу дівичу вмістився* і від Отцевого лона не розлучився,* з ангелами прийми і нас, Христе Боже, що співаємо тоб</w:t>
-      </w:r>
-      <w:r>
-        <w:rPr>
-          <w:rFonts w:ascii="Times New Roman" w:hAnsi="Times New Roman"/>
-          <w:sz w:val="24"/>
-          <w:szCs w:val="24"/>
-        </w:rPr>
-        <w:t>і:* Свят, свят, свят єси, Боже наш!* Богородиці ради, помилуй нас.</w:t>
+        <w:t>Ти, що в утробу дівичу вмістився* і від Отцевого лона не розлучився,* з ангелами прийми і нас, Христе Боже, що співаємо тобі:* Свят, свят, свят єси, Боже наш!* Богородиці ради, помилуй нас.</w:t>
       </w:r>
     </w:p>
     <w:p>
@@ -1588,15 +1676,7 @@
           <w:sz w:val="24"/>
           <w:szCs w:val="24"/>
         </w:rPr>
-        <w:t xml:space="preserve"> Безтілесними устами, безупинними славослов’ями,* шестикрилі співають тобі трисвяту пісню, Боже наш;* тож і ми, що на землі, недостойними устами хвалу тобі вчиняємо:* Свят, св</w:t>
-      </w:r>
-      <w:r>
-        <w:rPr>
-          <w:rFonts w:ascii="Times New Roman" w:hAnsi="Times New Roman"/>
-          <w:sz w:val="24"/>
-          <w:szCs w:val="24"/>
-        </w:rPr>
-        <w:t>ят, свят єси, Боже наш,*</w:t>
+        <w:t xml:space="preserve"> Безтілесними устами, безупинними славослов’ями,* шестикрилі співають тобі трисвяту пісню, Боже наш;* тож і ми, що на землі, недостойними устами хвалу тобі вчиняємо:* Свят, свят, свят єси, Боже наш,*</w:t>
       </w:r>
     </w:p>
     <w:p>
@@ -1807,15 +1887,23 @@
           <w:sz w:val="24"/>
           <w:szCs w:val="24"/>
         </w:rPr>
-        <w:t xml:space="preserve"> Херувими стоять перед тобою з острахом,* серафими жахаються з тремтінням* і, невмовкаючим голосом, трисвяту пісню приносять:* З ними і ми грішні співаємо:* Свят, свят, свят єси, Боже наш!* Задля молитов усіх свя</w:t>
-      </w:r>
-      <w:r>
-        <w:rPr>
-          <w:rFonts w:ascii="Times New Roman" w:hAnsi="Times New Roman"/>
-          <w:sz w:val="24"/>
-          <w:szCs w:val="24"/>
-        </w:rPr>
-        <w:t>тих твоїх, помилуй нас.</w:t>
+        <w:t xml:space="preserve"> Херувими стоять перед тобою з острахом,* серафими жахаються з тремтінням* і, невмовкаючим голосом, трисвяту пісню приносять:* З ними і ми грішні співаємо:* Свят, свят, свят єси, Боже наш!* Задля молитов усіх святих</w:t>
+      </w:r>
+      <w:r>
+        <w:rPr>
+          <w:rFonts w:ascii="Times New Roman" w:hAnsi="Times New Roman"/>
+          <w:sz w:val="24"/>
+          <w:szCs w:val="24"/>
+        </w:rPr>
+        <w:t xml:space="preserve"> Тво</w:t>
+      </w:r>
+      <w:r>
+        <w:rPr>
+          <w:rFonts w:ascii="Times New Roman" w:hAnsi="Times New Roman"/>
+          <w:sz w:val="24"/>
+          <w:szCs w:val="24"/>
+        </w:rPr>
+        <w:t>їх, помилуй нас.</w:t>
       </w:r>
     </w:p>
     <w:p>
@@ -1907,15 +1995,7 @@
           <w:sz w:val="24"/>
           <w:szCs w:val="24"/>
         </w:rPr>
-        <w:t xml:space="preserve"> Неприступному Божеству – одному в Тройці,* вчиняючи</w:t>
-      </w:r>
-      <w:r>
-        <w:rPr>
-          <w:rFonts w:ascii="Times New Roman" w:hAnsi="Times New Roman"/>
-          <w:sz w:val="24"/>
-          <w:szCs w:val="24"/>
-        </w:rPr>
-        <w:t xml:space="preserve"> серафимську трисвяту хвалу, з острахом заспіваймо:* Свят, свят, свят єси, Боже наш:*</w:t>
+        <w:t xml:space="preserve"> Неприступному Божеству – одному в Тройці,* вчиняючи серафимську трисвяту хвалу, з острахом заспіваймо:* Свят, свят, свят єси, Боже наш:*</w:t>
       </w:r>
     </w:p>
     <w:p>
@@ -2079,7 +2159,23 @@
           <w:sz w:val="24"/>
           <w:szCs w:val="24"/>
         </w:rPr>
-        <w:t xml:space="preserve"> – Задля молитов святих апостолів твоїх і святителя Миколая, помилуй нас,</w:t>
+        <w:t xml:space="preserve"> – Задля молитов святих апостолів</w:t>
+      </w:r>
+      <w:r>
+        <w:rPr>
+          <w:rFonts w:ascii="Times New Roman" w:hAnsi="Times New Roman"/>
+          <w:sz w:val="24"/>
+          <w:szCs w:val="24"/>
+        </w:rPr>
+        <w:t xml:space="preserve"> Тво</w:t>
+      </w:r>
+      <w:r>
+        <w:rPr>
+          <w:rFonts w:ascii="Times New Roman" w:hAnsi="Times New Roman"/>
+          <w:sz w:val="24"/>
+          <w:szCs w:val="24"/>
+        </w:rPr>
+        <w:t>їх і святителя Миколая, помилуй нас,</w:t>
       </w:r>
     </w:p>
     <w:p>
@@ -2107,15 +2203,23 @@
           <w:sz w:val="24"/>
           <w:szCs w:val="24"/>
         </w:rPr>
-        <w:t xml:space="preserve"> Відклади, душе, лінивство як сон,* і покажи Судді готовість до хваління, та з острахом заспівай:* Свят, свят, свят єси, Боже на</w:t>
-      </w:r>
-      <w:r>
-        <w:rPr>
-          <w:rFonts w:ascii="Times New Roman" w:hAnsi="Times New Roman"/>
-          <w:sz w:val="24"/>
-          <w:szCs w:val="24"/>
-        </w:rPr>
-        <w:t>ш!* Задля молитов усіх святих твоїх, помилуй нас.</w:t>
+        <w:t xml:space="preserve"> Відклади, душе, лінивство як сон,* і покажи Судді готовість до хваління, та з острахом заспівай:* Свят, свят, свят єси, Боже наш!* Задля молитов усіх святих</w:t>
+      </w:r>
+      <w:r>
+        <w:rPr>
+          <w:rFonts w:ascii="Times New Roman" w:hAnsi="Times New Roman"/>
+          <w:sz w:val="24"/>
+          <w:szCs w:val="24"/>
+        </w:rPr>
+        <w:t xml:space="preserve"> Тво</w:t>
+      </w:r>
+      <w:r>
+        <w:rPr>
+          <w:rFonts w:ascii="Times New Roman" w:hAnsi="Times New Roman"/>
+          <w:sz w:val="24"/>
+          <w:szCs w:val="24"/>
+        </w:rPr>
+        <w:t>їх, помилуй нас.</w:t>
       </w:r>
     </w:p>
     <w:p>
@@ -2207,15 +2311,7 @@
           <w:sz w:val="24"/>
           <w:szCs w:val="24"/>
         </w:rPr>
-        <w:t xml:space="preserve"> До неба підне</w:t>
-      </w:r>
-      <w:r>
-        <w:rPr>
-          <w:rFonts w:ascii="Times New Roman" w:hAnsi="Times New Roman"/>
-          <w:sz w:val="24"/>
-          <w:szCs w:val="24"/>
-        </w:rPr>
-        <w:t>сім серця, наслідуймо ангельський чин,* і з острахом припадьмо до Судді,* та співаймо переможну хвалу:* Свят, свят, свят єси, Боже наш,*</w:t>
+        <w:t xml:space="preserve"> До неба піднесім серця, наслідуймо ангельський чин,* і з острахом припадьмо до Судді,* та співаймо переможну хвалу:* Свят, свят, свят єси, Боже наш,*</w:t>
       </w:r>
     </w:p>
     <w:p>
@@ -2305,15 +2401,7 @@
           <w:sz w:val="24"/>
           <w:szCs w:val="24"/>
         </w:rPr>
-        <w:t xml:space="preserve">, помилуй </w:t>
-      </w:r>
-      <w:r>
-        <w:rPr>
-          <w:rFonts w:ascii="Times New Roman" w:hAnsi="Times New Roman"/>
-          <w:sz w:val="24"/>
-          <w:szCs w:val="24"/>
-        </w:rPr>
-        <w:t>нас.</w:t>
+        <w:t>, помилуй нас.</w:t>
       </w:r>
     </w:p>
     <w:p>
@@ -2431,15 +2519,23 @@
           <w:sz w:val="24"/>
           <w:szCs w:val="24"/>
         </w:rPr>
-        <w:t xml:space="preserve"> Не сміючи на тебе дивитись, херувими, літаючи,* з окликом співають божественну пісню трисвятого гол</w:t>
-      </w:r>
-      <w:r>
-        <w:rPr>
-          <w:rFonts w:ascii="Times New Roman" w:hAnsi="Times New Roman"/>
-          <w:sz w:val="24"/>
-          <w:szCs w:val="24"/>
-        </w:rPr>
-        <w:t>осу;* з ними й ми співаємо тобі:* Свят, свят, свят єси, Боже наш!* Задля молитов усіх святих твоїх, помилуй нас.</w:t>
+        <w:t xml:space="preserve"> Не сміючи на тебе дивитись, херувими, літаючи,* з окликом співають божественну пісню трисвятого голосу;* з ними й ми співаємо тобі:* Свят, свят, свят єси, Боже наш!* Задля молитов усіх святих</w:t>
+      </w:r>
+      <w:r>
+        <w:rPr>
+          <w:rFonts w:ascii="Times New Roman" w:hAnsi="Times New Roman"/>
+          <w:sz w:val="24"/>
+          <w:szCs w:val="24"/>
+        </w:rPr>
+        <w:t xml:space="preserve"> Тво</w:t>
+      </w:r>
+      <w:r>
+        <w:rPr>
+          <w:rFonts w:ascii="Times New Roman" w:hAnsi="Times New Roman"/>
+          <w:sz w:val="24"/>
+          <w:szCs w:val="24"/>
+        </w:rPr>
+        <w:t>їх, помилуй нас.</w:t>
       </w:r>
     </w:p>
     <w:p>
@@ -2465,15 +2561,7 @@
           <w:sz w:val="24"/>
           <w:szCs w:val="24"/>
         </w:rPr>
-        <w:t xml:space="preserve"> Пригноблені безліччю наших гріхів,* і не сміючи поглянути на висоту небесну,* приклонили ми душу і тіло* та з ангелами пісню тобі співа</w:t>
-      </w:r>
-      <w:r>
-        <w:rPr>
-          <w:rFonts w:ascii="Times New Roman" w:hAnsi="Times New Roman"/>
-          <w:sz w:val="24"/>
-          <w:szCs w:val="24"/>
-        </w:rPr>
-        <w:t>ємо:* Свят, свят, свят єси, Боже наш!* Богородиці ради, помилуй нас.</w:t>
+        <w:t xml:space="preserve"> Пригноблені безліччю наших гріхів,* і не сміючи поглянути на висоту небесну,* приклонили ми душу і тіло* та з ангелами пісню тобі співаємо:* Свят, свят, свят єси, Боже наш!* Богородиці ради, помилуй нас.</w:t>
       </w:r>
       <w:r>
         <w:rPr>
@@ -2609,17 +2697,7 @@
           <w:sz w:val="24"/>
           <w:szCs w:val="24"/>
         </w:rPr>
-        <w:t>(:) У вівтор</w:t>
-      </w:r>
-      <w:r>
-        <w:rPr>
-          <w:rFonts w:ascii="Times New Roman" w:hAnsi="Times New Roman"/>
-          <w:i/>
-          <w:color w:val="FF0000"/>
-          <w:sz w:val="24"/>
-          <w:szCs w:val="24"/>
-        </w:rPr>
-        <w:t>ок</w:t>
+        <w:t>(:) У вівторок</w:t>
       </w:r>
       <w:r>
         <w:rPr>
@@ -2737,15 +2815,23 @@
           <w:sz w:val="24"/>
           <w:szCs w:val="24"/>
         </w:rPr>
-        <w:t xml:space="preserve"> Господи, що світло засвітив,* очисти душу мою від у</w:t>
-      </w:r>
-      <w:r>
-        <w:rPr>
-          <w:rFonts w:ascii="Times New Roman" w:hAnsi="Times New Roman"/>
-          <w:sz w:val="24"/>
-          <w:szCs w:val="24"/>
-        </w:rPr>
-        <w:t>сякого гріха,* задля молитов усіх святих твоїх, і спаси мене.</w:t>
+        <w:t xml:space="preserve"> Господи, що світло засвітив,* очисти душу мою від усякого гріха,* задля молитов усіх святих</w:t>
+      </w:r>
+      <w:r>
+        <w:rPr>
+          <w:rFonts w:ascii="Times New Roman" w:hAnsi="Times New Roman"/>
+          <w:sz w:val="24"/>
+          <w:szCs w:val="24"/>
+        </w:rPr>
+        <w:t xml:space="preserve"> Тво</w:t>
+      </w:r>
+      <w:r>
+        <w:rPr>
+          <w:rFonts w:ascii="Times New Roman" w:hAnsi="Times New Roman"/>
+          <w:sz w:val="24"/>
+          <w:szCs w:val="24"/>
+        </w:rPr>
+        <w:t>їх, і спаси мене.</w:t>
       </w:r>
     </w:p>
     <w:p>
@@ -2826,7 +2912,23 @@
           <w:sz w:val="24"/>
           <w:szCs w:val="24"/>
         </w:rPr>
-        <w:t xml:space="preserve"> Світло твоє споконвічне зішли, Христе Боже,* і просвіти таємні очі мого серця,*</w:t>
+        <w:t xml:space="preserve"> Світло</w:t>
+      </w:r>
+      <w:r>
+        <w:rPr>
+          <w:rFonts w:ascii="Times New Roman" w:hAnsi="Times New Roman"/>
+          <w:sz w:val="24"/>
+          <w:szCs w:val="24"/>
+        </w:rPr>
+        <w:t xml:space="preserve"> Тво</w:t>
+      </w:r>
+      <w:r>
+        <w:rPr>
+          <w:rFonts w:ascii="Times New Roman" w:hAnsi="Times New Roman"/>
+          <w:sz w:val="24"/>
+          <w:szCs w:val="24"/>
+        </w:rPr>
+        <w:t>є споконвічне зішли, Христе Боже,* і просвіти таємні очі мого серця,*</w:t>
       </w:r>
     </w:p>
     <w:p>
@@ -3002,7 +3104,39 @@
           <w:sz w:val="24"/>
           <w:szCs w:val="24"/>
         </w:rPr>
-        <w:t xml:space="preserve"> Світло твоє споконвічне зішли, Христе Боже,* і просвіти таємні очі мого серця,* задля молитов усіх святих твоїх, і спаси мене.</w:t>
+        <w:t xml:space="preserve"> Світло</w:t>
+      </w:r>
+      <w:r>
+        <w:rPr>
+          <w:rFonts w:ascii="Times New Roman" w:hAnsi="Times New Roman"/>
+          <w:sz w:val="24"/>
+          <w:szCs w:val="24"/>
+        </w:rPr>
+        <w:t xml:space="preserve"> Тво</w:t>
+      </w:r>
+      <w:r>
+        <w:rPr>
+          <w:rFonts w:ascii="Times New Roman" w:hAnsi="Times New Roman"/>
+          <w:sz w:val="24"/>
+          <w:szCs w:val="24"/>
+        </w:rPr>
+        <w:t>є споконвічне зішли, Христе Боже,* і просвіти таємні очі мого серця,* задля молитов усіх святих</w:t>
+      </w:r>
+      <w:r>
+        <w:rPr>
+          <w:rFonts w:ascii="Times New Roman" w:hAnsi="Times New Roman"/>
+          <w:sz w:val="24"/>
+          <w:szCs w:val="24"/>
+        </w:rPr>
+        <w:t xml:space="preserve"> Тво</w:t>
+      </w:r>
+      <w:r>
+        <w:rPr>
+          <w:rFonts w:ascii="Times New Roman" w:hAnsi="Times New Roman"/>
+          <w:sz w:val="24"/>
+          <w:szCs w:val="24"/>
+        </w:rPr>
+        <w:t>їх, і спаси мене.</w:t>
       </w:r>
     </w:p>
     <w:p>
@@ -3030,15 +3164,23 @@
           <w:sz w:val="24"/>
           <w:szCs w:val="24"/>
         </w:rPr>
-        <w:t xml:space="preserve"> Світло твоє споконвічне зішли, Христе Б</w:t>
-      </w:r>
-      <w:r>
-        <w:rPr>
-          <w:rFonts w:ascii="Times New Roman" w:hAnsi="Times New Roman"/>
-          <w:sz w:val="24"/>
-          <w:szCs w:val="24"/>
-        </w:rPr>
-        <w:t>оже,* і просвіти таємні очі мого серця,* задля молитов Богородиці, і спаси мене.</w:t>
+        <w:t xml:space="preserve"> Світло</w:t>
+      </w:r>
+      <w:r>
+        <w:rPr>
+          <w:rFonts w:ascii="Times New Roman" w:hAnsi="Times New Roman"/>
+          <w:sz w:val="24"/>
+          <w:szCs w:val="24"/>
+        </w:rPr>
+        <w:t xml:space="preserve"> Тво</w:t>
+      </w:r>
+      <w:r>
+        <w:rPr>
+          <w:rFonts w:ascii="Times New Roman" w:hAnsi="Times New Roman"/>
+          <w:sz w:val="24"/>
+          <w:szCs w:val="24"/>
+        </w:rPr>
+        <w:t>є споконвічне зішли, Христе Боже,* і просвіти таємні очі мого серця,* задля молитов Богородиці, і спаси мене.</w:t>
       </w:r>
     </w:p>
     <w:p>
@@ -3091,7 +3233,23 @@
           <w:sz w:val="24"/>
           <w:szCs w:val="24"/>
         </w:rPr>
-        <w:t xml:space="preserve"> Зішли світло твоє, Христе Боже,* і просвіти серце моє,*</w:t>
+        <w:t xml:space="preserve"> Зішли світло</w:t>
+      </w:r>
+      <w:r>
+        <w:rPr>
+          <w:rFonts w:ascii="Times New Roman" w:hAnsi="Times New Roman"/>
+          <w:sz w:val="24"/>
+          <w:szCs w:val="24"/>
+        </w:rPr>
+        <w:t xml:space="preserve"> Тво</w:t>
+      </w:r>
+      <w:r>
+        <w:rPr>
+          <w:rFonts w:ascii="Times New Roman" w:hAnsi="Times New Roman"/>
+          <w:sz w:val="24"/>
+          <w:szCs w:val="24"/>
+        </w:rPr>
+        <w:t>є, Христе Боже,* і просвіти серце моє,*</w:t>
       </w:r>
     </w:p>
     <w:p>
@@ -3267,15 +3425,39 @@
           <w:sz w:val="24"/>
           <w:szCs w:val="24"/>
         </w:rPr>
-        <w:t xml:space="preserve"> Зішли світло твоє, Христе Боже,* і просвіти серце моє,* задля молитов усіх св</w:t>
-      </w:r>
-      <w:r>
-        <w:rPr>
-          <w:rFonts w:ascii="Times New Roman" w:hAnsi="Times New Roman"/>
-          <w:sz w:val="24"/>
-          <w:szCs w:val="24"/>
-        </w:rPr>
-        <w:t>ятих твоїх, і спаси мене.</w:t>
+        <w:t xml:space="preserve"> Зішли світло</w:t>
+      </w:r>
+      <w:r>
+        <w:rPr>
+          <w:rFonts w:ascii="Times New Roman" w:hAnsi="Times New Roman"/>
+          <w:sz w:val="24"/>
+          <w:szCs w:val="24"/>
+        </w:rPr>
+        <w:t xml:space="preserve"> Тво</w:t>
+      </w:r>
+      <w:r>
+        <w:rPr>
+          <w:rFonts w:ascii="Times New Roman" w:hAnsi="Times New Roman"/>
+          <w:sz w:val="24"/>
+          <w:szCs w:val="24"/>
+        </w:rPr>
+        <w:t>є, Христе Боже,* і просвіти серце моє,* задля молитов усіх святих</w:t>
+      </w:r>
+      <w:r>
+        <w:rPr>
+          <w:rFonts w:ascii="Times New Roman" w:hAnsi="Times New Roman"/>
+          <w:sz w:val="24"/>
+          <w:szCs w:val="24"/>
+        </w:rPr>
+        <w:t xml:space="preserve"> Тво</w:t>
+      </w:r>
+      <w:r>
+        <w:rPr>
+          <w:rFonts w:ascii="Times New Roman" w:hAnsi="Times New Roman"/>
+          <w:sz w:val="24"/>
+          <w:szCs w:val="24"/>
+        </w:rPr>
+        <w:t>їх, і спаси мене.</w:t>
       </w:r>
     </w:p>
     <w:p>
@@ -3303,7 +3485,23 @@
           <w:sz w:val="24"/>
           <w:szCs w:val="24"/>
         </w:rPr>
-        <w:t xml:space="preserve"> Зішли світло твоє, Христе Боже,* і просвіти серце моє:* задля молитов Богородиці, і спаси мене.</w:t>
+        <w:t xml:space="preserve"> Зішли світло</w:t>
+      </w:r>
+      <w:r>
+        <w:rPr>
+          <w:rFonts w:ascii="Times New Roman" w:hAnsi="Times New Roman"/>
+          <w:sz w:val="24"/>
+          <w:szCs w:val="24"/>
+        </w:rPr>
+        <w:t xml:space="preserve"> Тво</w:t>
+      </w:r>
+      <w:r>
+        <w:rPr>
+          <w:rFonts w:ascii="Times New Roman" w:hAnsi="Times New Roman"/>
+          <w:sz w:val="24"/>
+          <w:szCs w:val="24"/>
+        </w:rPr>
+        <w:t>є, Христе Боже,* і просвіти серце моє:* задля молитов Богородиці, і спаси мене.</w:t>
       </w:r>
     </w:p>
     <w:p>
@@ -3541,7 +3739,15 @@
           <w:sz w:val="24"/>
           <w:szCs w:val="24"/>
         </w:rPr>
-        <w:t xml:space="preserve"> твоїх, і спаси мене.</w:t>
+        <w:t xml:space="preserve"> Тво</w:t>
+      </w:r>
+      <w:r>
+        <w:rPr>
+          <w:rFonts w:ascii="Times New Roman" w:hAnsi="Times New Roman"/>
+          <w:sz w:val="24"/>
+          <w:szCs w:val="24"/>
+        </w:rPr>
+        <w:t>їх, і спаси мене.</w:t>
       </w:r>
     </w:p>
     <w:p>
@@ -3622,7 +3828,23 @@
           <w:sz w:val="24"/>
           <w:szCs w:val="24"/>
         </w:rPr>
-        <w:t xml:space="preserve"> Світла подателю, Господи,* зішли світло твоє і просвіти серце моє,*</w:t>
+        <w:t xml:space="preserve"> Світла подателю, Господи,* зішли світло</w:t>
+      </w:r>
+      <w:r>
+        <w:rPr>
+          <w:rFonts w:ascii="Times New Roman" w:hAnsi="Times New Roman"/>
+          <w:sz w:val="24"/>
+          <w:szCs w:val="24"/>
+        </w:rPr>
+        <w:t xml:space="preserve"> Тво</w:t>
+      </w:r>
+      <w:r>
+        <w:rPr>
+          <w:rFonts w:ascii="Times New Roman" w:hAnsi="Times New Roman"/>
+          <w:sz w:val="24"/>
+          <w:szCs w:val="24"/>
+        </w:rPr>
+        <w:t>є і просвіти серце моє,*</w:t>
       </w:r>
     </w:p>
     <w:p>
@@ -3802,15 +4024,7 @@
           <w:sz w:val="24"/>
           <w:szCs w:val="24"/>
         </w:rPr>
-        <w:t>і святителя Миколая, п</w:t>
-      </w:r>
-      <w:r>
-        <w:rPr>
-          <w:rFonts w:ascii="Times New Roman" w:hAnsi="Times New Roman"/>
-          <w:sz w:val="24"/>
-          <w:szCs w:val="24"/>
-        </w:rPr>
-        <w:t>омилуй нас.</w:t>
+        <w:t>і святителя Миколая, помилуй нас.</w:t>
       </w:r>
     </w:p>
     <w:p>
@@ -3838,7 +4052,39 @@
           <w:sz w:val="24"/>
           <w:szCs w:val="24"/>
         </w:rPr>
-        <w:t xml:space="preserve"> Світла подателю, Господи,* зішли світло твоє і просвіти серце моє,* задля молитов усіх святих твоїх, і спаси мене.</w:t>
+        <w:t xml:space="preserve"> Світла подателю, Господи,* зішли світло</w:t>
+      </w:r>
+      <w:r>
+        <w:rPr>
+          <w:rFonts w:ascii="Times New Roman" w:hAnsi="Times New Roman"/>
+          <w:sz w:val="24"/>
+          <w:szCs w:val="24"/>
+        </w:rPr>
+        <w:t xml:space="preserve"> Тво</w:t>
+      </w:r>
+      <w:r>
+        <w:rPr>
+          <w:rFonts w:ascii="Times New Roman" w:hAnsi="Times New Roman"/>
+          <w:sz w:val="24"/>
+          <w:szCs w:val="24"/>
+        </w:rPr>
+        <w:t>є і просвіти серце моє,* задля молитов усіх святих</w:t>
+      </w:r>
+      <w:r>
+        <w:rPr>
+          <w:rFonts w:ascii="Times New Roman" w:hAnsi="Times New Roman"/>
+          <w:sz w:val="24"/>
+          <w:szCs w:val="24"/>
+        </w:rPr>
+        <w:t xml:space="preserve"> Тво</w:t>
+      </w:r>
+      <w:r>
+        <w:rPr>
+          <w:rFonts w:ascii="Times New Roman" w:hAnsi="Times New Roman"/>
+          <w:sz w:val="24"/>
+          <w:szCs w:val="24"/>
+        </w:rPr>
+        <w:t>їх, і спаси мене.</w:t>
       </w:r>
     </w:p>
     <w:p>
@@ -3866,7 +4112,23 @@
           <w:sz w:val="24"/>
           <w:szCs w:val="24"/>
         </w:rPr>
-        <w:t xml:space="preserve"> Світла подателю, Господи,* зішли світло твоє і просвіти серце моє,* задля молитов Богородиці, і спаси мене.</w:t>
+        <w:t xml:space="preserve"> Світла подателю, Господи,* зішли світло</w:t>
+      </w:r>
+      <w:r>
+        <w:rPr>
+          <w:rFonts w:ascii="Times New Roman" w:hAnsi="Times New Roman"/>
+          <w:sz w:val="24"/>
+          <w:szCs w:val="24"/>
+        </w:rPr>
+        <w:t xml:space="preserve"> Тво</w:t>
+      </w:r>
+      <w:r>
+        <w:rPr>
+          <w:rFonts w:ascii="Times New Roman" w:hAnsi="Times New Roman"/>
+          <w:sz w:val="24"/>
+          <w:szCs w:val="24"/>
+        </w:rPr>
+        <w:t>є і просвіти серце моє,* задля молитов Богородиці, і спаси мене.</w:t>
       </w:r>
     </w:p>
     <w:p>
@@ -3919,7 +4181,23 @@
           <w:sz w:val="24"/>
           <w:szCs w:val="24"/>
         </w:rPr>
-        <w:t xml:space="preserve"> Господи, зішли душам нашим споконвічне твоє світло,*</w:t>
+        <w:t xml:space="preserve"> Господи, зішли душам нашим споконвічне</w:t>
+      </w:r>
+      <w:r>
+        <w:rPr>
+          <w:rFonts w:ascii="Times New Roman" w:hAnsi="Times New Roman"/>
+          <w:sz w:val="24"/>
+          <w:szCs w:val="24"/>
+        </w:rPr>
+        <w:t xml:space="preserve"> Тво</w:t>
+      </w:r>
+      <w:r>
+        <w:rPr>
+          <w:rFonts w:ascii="Times New Roman" w:hAnsi="Times New Roman"/>
+          <w:sz w:val="24"/>
+          <w:szCs w:val="24"/>
+        </w:rPr>
+        <w:t>є світло,*</w:t>
       </w:r>
     </w:p>
     <w:p>
@@ -4119,24 +4397,47 @@
           <w:sz w:val="24"/>
           <w:szCs w:val="24"/>
         </w:rPr>
-        <w:t>Сла</w:t>
-      </w:r>
-      <w:r>
-        <w:rPr>
-          <w:rFonts w:ascii="Times New Roman" w:hAnsi="Times New Roman"/>
-          <w:b/>
-          <w:sz w:val="24"/>
-          <w:szCs w:val="24"/>
-        </w:rPr>
-        <w:t>ва:</w:t>
-      </w:r>
-      <w:r>
-        <w:rPr>
-          <w:rFonts w:ascii="Times New Roman" w:hAnsi="Times New Roman"/>
-          <w:sz w:val="24"/>
-          <w:szCs w:val="24"/>
-        </w:rPr>
-        <w:t xml:space="preserve"> Господи, зішли душам нашим споконвічне твоє світло,* задля молитов усіх святих твоїх, і спаси мене.</w:t>
+        <w:t>Слава:</w:t>
+      </w:r>
+      <w:r>
+        <w:rPr>
+          <w:rFonts w:ascii="Times New Roman" w:hAnsi="Times New Roman"/>
+          <w:sz w:val="24"/>
+          <w:szCs w:val="24"/>
+        </w:rPr>
+        <w:t xml:space="preserve"> Господи, зішли душам нашим споконвічне</w:t>
+      </w:r>
+      <w:r>
+        <w:rPr>
+          <w:rFonts w:ascii="Times New Roman" w:hAnsi="Times New Roman"/>
+          <w:sz w:val="24"/>
+          <w:szCs w:val="24"/>
+        </w:rPr>
+        <w:t xml:space="preserve"> Тво</w:t>
+      </w:r>
+      <w:r>
+        <w:rPr>
+          <w:rFonts w:ascii="Times New Roman" w:hAnsi="Times New Roman"/>
+          <w:sz w:val="24"/>
+          <w:szCs w:val="24"/>
+        </w:rPr>
+        <w:t>є світло,* задля молитов усіх святих</w:t>
+      </w:r>
+      <w:r>
+        <w:rPr>
+          <w:rFonts w:ascii="Times New Roman" w:hAnsi="Times New Roman"/>
+          <w:sz w:val="24"/>
+          <w:szCs w:val="24"/>
+        </w:rPr>
+        <w:t xml:space="preserve"> Тво</w:t>
+      </w:r>
+      <w:r>
+        <w:rPr>
+          <w:rFonts w:ascii="Times New Roman" w:hAnsi="Times New Roman"/>
+          <w:sz w:val="24"/>
+          <w:szCs w:val="24"/>
+        </w:rPr>
+        <w:t>їх, і спаси мене.</w:t>
       </w:r>
     </w:p>
     <w:p>
@@ -4164,7 +4465,23 @@
           <w:sz w:val="24"/>
           <w:szCs w:val="24"/>
         </w:rPr>
-        <w:t xml:space="preserve"> Господи, зішли душам нашим споконвічне твоє світло,* задля молитов Богородиці, і спаси мене.</w:t>
+        <w:t xml:space="preserve"> Господи, зішли душам нашим споконвічне</w:t>
+      </w:r>
+      <w:r>
+        <w:rPr>
+          <w:rFonts w:ascii="Times New Roman" w:hAnsi="Times New Roman"/>
+          <w:sz w:val="24"/>
+          <w:szCs w:val="24"/>
+        </w:rPr>
+        <w:t xml:space="preserve"> Тво</w:t>
+      </w:r>
+      <w:r>
+        <w:rPr>
+          <w:rFonts w:ascii="Times New Roman" w:hAnsi="Times New Roman"/>
+          <w:sz w:val="24"/>
+          <w:szCs w:val="24"/>
+        </w:rPr>
+        <w:t>є світло,* задля молитов Богородиці, і спаси мене.</w:t>
       </w:r>
     </w:p>
     <w:p>
@@ -4217,15 +4534,39 @@
           <w:sz w:val="24"/>
           <w:szCs w:val="24"/>
         </w:rPr>
-        <w:t xml:space="preserve"> Піднеси мене, Господи, до твого вели</w:t>
-      </w:r>
-      <w:r>
-        <w:rPr>
-          <w:rFonts w:ascii="Times New Roman" w:hAnsi="Times New Roman"/>
-          <w:sz w:val="24"/>
-          <w:szCs w:val="24"/>
-        </w:rPr>
-        <w:t>чання* і навчи мене чинити волю твою, Святий,*</w:t>
+        <w:t xml:space="preserve"> Піднеси мене, Господи, до</w:t>
+      </w:r>
+      <w:r>
+        <w:rPr>
+          <w:rFonts w:ascii="Times New Roman" w:hAnsi="Times New Roman"/>
+          <w:sz w:val="24"/>
+          <w:szCs w:val="24"/>
+        </w:rPr>
+        <w:t xml:space="preserve"> Тво</w:t>
+      </w:r>
+      <w:r>
+        <w:rPr>
+          <w:rFonts w:ascii="Times New Roman" w:hAnsi="Times New Roman"/>
+          <w:sz w:val="24"/>
+          <w:szCs w:val="24"/>
+        </w:rPr>
+        <w:t>го величання* і навчи мене чинити волю</w:t>
+      </w:r>
+      <w:r>
+        <w:rPr>
+          <w:rFonts w:ascii="Times New Roman" w:hAnsi="Times New Roman"/>
+          <w:sz w:val="24"/>
+          <w:szCs w:val="24"/>
+        </w:rPr>
+        <w:t xml:space="preserve"> Тво</w:t>
+      </w:r>
+      <w:r>
+        <w:rPr>
+          <w:rFonts w:ascii="Times New Roman" w:hAnsi="Times New Roman"/>
+          <w:sz w:val="24"/>
+          <w:szCs w:val="24"/>
+        </w:rPr>
+        <w:t>ю, Святий,*</w:t>
       </w:r>
     </w:p>
     <w:p>
@@ -4434,7 +4775,55 @@
           <w:sz w:val="24"/>
           <w:szCs w:val="24"/>
         </w:rPr>
-        <w:t xml:space="preserve"> Піднеси мене, Господи, до твого величання* і навчи мене чинити волю твою, Святий,* задля молитов усіх святих твоїх, і спаси мене.</w:t>
+        <w:t xml:space="preserve"> Піднеси мене, Господи, до</w:t>
+      </w:r>
+      <w:r>
+        <w:rPr>
+          <w:rFonts w:ascii="Times New Roman" w:hAnsi="Times New Roman"/>
+          <w:sz w:val="24"/>
+          <w:szCs w:val="24"/>
+        </w:rPr>
+        <w:t xml:space="preserve"> Тво</w:t>
+      </w:r>
+      <w:r>
+        <w:rPr>
+          <w:rFonts w:ascii="Times New Roman" w:hAnsi="Times New Roman"/>
+          <w:sz w:val="24"/>
+          <w:szCs w:val="24"/>
+        </w:rPr>
+        <w:t>го величання* і навчи мене чинити волю</w:t>
+      </w:r>
+      <w:r>
+        <w:rPr>
+          <w:rFonts w:ascii="Times New Roman" w:hAnsi="Times New Roman"/>
+          <w:sz w:val="24"/>
+          <w:szCs w:val="24"/>
+        </w:rPr>
+        <w:t xml:space="preserve"> Тво</w:t>
+      </w:r>
+      <w:r>
+        <w:rPr>
+          <w:rFonts w:ascii="Times New Roman" w:hAnsi="Times New Roman"/>
+          <w:sz w:val="24"/>
+          <w:szCs w:val="24"/>
+        </w:rPr>
+        <w:t>ю, Святий,* задля молитов усіх святих</w:t>
+      </w:r>
+      <w:r>
+        <w:rPr>
+          <w:rFonts w:ascii="Times New Roman" w:hAnsi="Times New Roman"/>
+          <w:sz w:val="24"/>
+          <w:szCs w:val="24"/>
+        </w:rPr>
+        <w:t xml:space="preserve"> Тво</w:t>
+      </w:r>
+      <w:r>
+        <w:rPr>
+          <w:rFonts w:ascii="Times New Roman" w:hAnsi="Times New Roman"/>
+          <w:sz w:val="24"/>
+          <w:szCs w:val="24"/>
+        </w:rPr>
+        <w:t>їх, і спаси мене.</w:t>
       </w:r>
     </w:p>
     <w:p>
@@ -4462,15 +4851,39 @@
           <w:sz w:val="24"/>
           <w:szCs w:val="24"/>
         </w:rPr>
-        <w:t xml:space="preserve"> Піднеси мене, Господи, до твого величання* і навчи </w:t>
-      </w:r>
-      <w:r>
-        <w:rPr>
-          <w:rFonts w:ascii="Times New Roman" w:hAnsi="Times New Roman"/>
-          <w:sz w:val="24"/>
-          <w:szCs w:val="24"/>
-        </w:rPr>
-        <w:t>мене чинити волю твою, Святий,* задля молитов Богородиці, і спаси мене.</w:t>
+        <w:t xml:space="preserve"> Піднеси мене, Господи, до</w:t>
+      </w:r>
+      <w:r>
+        <w:rPr>
+          <w:rFonts w:ascii="Times New Roman" w:hAnsi="Times New Roman"/>
+          <w:sz w:val="24"/>
+          <w:szCs w:val="24"/>
+        </w:rPr>
+        <w:t xml:space="preserve"> Тво</w:t>
+      </w:r>
+      <w:r>
+        <w:rPr>
+          <w:rFonts w:ascii="Times New Roman" w:hAnsi="Times New Roman"/>
+          <w:sz w:val="24"/>
+          <w:szCs w:val="24"/>
+        </w:rPr>
+        <w:t>го величання* і навчи мене чинити волю</w:t>
+      </w:r>
+      <w:r>
+        <w:rPr>
+          <w:rFonts w:ascii="Times New Roman" w:hAnsi="Times New Roman"/>
+          <w:sz w:val="24"/>
+          <w:szCs w:val="24"/>
+        </w:rPr>
+        <w:t xml:space="preserve"> Тво</w:t>
+      </w:r>
+      <w:r>
+        <w:rPr>
+          <w:rFonts w:ascii="Times New Roman" w:hAnsi="Times New Roman"/>
+          <w:sz w:val="24"/>
+          <w:szCs w:val="24"/>
+        </w:rPr>
+        <w:t>ю, Святий,* задля молитов Богородиці, і спаси мене.</w:t>
       </w:r>
     </w:p>
     <w:p>
@@ -4613,15 +5026,7 @@
           <w:sz w:val="24"/>
           <w:szCs w:val="24"/>
         </w:rPr>
-        <w:t>, помилуй нас</w:t>
-      </w:r>
-      <w:r>
-        <w:rPr>
-          <w:rFonts w:ascii="Times New Roman" w:hAnsi="Times New Roman"/>
-          <w:sz w:val="24"/>
-          <w:szCs w:val="24"/>
-        </w:rPr>
-        <w:t>.</w:t>
+        <w:t>, помилуй нас.</w:t>
       </w:r>
     </w:p>
     <w:p>
@@ -4739,7 +5144,23 @@
           <w:sz w:val="24"/>
           <w:szCs w:val="24"/>
         </w:rPr>
-        <w:t xml:space="preserve"> Будучи світлом, Христе,* просвіти мене собою,* задля молитов усіх святих твоїх, і спаси мене.</w:t>
+        <w:t xml:space="preserve"> Будучи світлом, Христе,* просвіти мене собою,* задля молитов усіх святих</w:t>
+      </w:r>
+      <w:r>
+        <w:rPr>
+          <w:rFonts w:ascii="Times New Roman" w:hAnsi="Times New Roman"/>
+          <w:sz w:val="24"/>
+          <w:szCs w:val="24"/>
+        </w:rPr>
+        <w:t xml:space="preserve"> Тво</w:t>
+      </w:r>
+      <w:r>
+        <w:rPr>
+          <w:rFonts w:ascii="Times New Roman" w:hAnsi="Times New Roman"/>
+          <w:sz w:val="24"/>
+          <w:szCs w:val="24"/>
+        </w:rPr>
+        <w:t>їх, і спаси мене.</w:t>
       </w:r>
     </w:p>
     <w:p>

</xml_diff>